<commit_message>
update report: correct supervisor and student details
- Submitted To: Surajeet Ghosh (Associate Professor)
- Submitted By: Anurag Chaurasia (2022ccsb098), Rajesh Kumar (2022csb094), Adrija Paul (2022csb082)
- Updated certificate body and signature accordingly

Co-Authored-By: Claude Sonnet 4.6 <noreply@anthropic.com>
</commit_message>
<xml_diff>
--- a/MajorProject_Prot2Chat_Report.docx
+++ b/MajorProject_Prot2Chat_Report.docx
@@ -93,18 +93,10 @@
       </w:pPr>
       <w:r>
         <w:rPr>
-          <w:rFonts w:ascii="Calibri" w:hAnsi="Calibri"/>
           <w:b/>
           <w:sz w:val="24"/>
         </w:rPr>
-        <w:t xml:space="preserve">Submitted To: </w:t>
-      </w:r>
-      <w:r>
-        <w:rPr>
-          <w:rFonts w:ascii="Calibri" w:hAnsi="Calibri"/>
-          <w:sz w:val="24"/>
-        </w:rPr>
-        <w:t>Dr. Apurba Sarkar (Head of Department)</w:t>
+        <w:t>Submitted To: Surajeet Ghosh (Associate Professor)</w:t>
       </w:r>
     </w:p>
     <w:p>
@@ -113,18 +105,10 @@
       </w:pPr>
       <w:r>
         <w:rPr>
-          <w:rFonts w:ascii="Calibri" w:hAnsi="Calibri"/>
           <w:b/>
           <w:sz w:val="24"/>
         </w:rPr>
-        <w:t xml:space="preserve">Submitted By: </w:t>
-      </w:r>
-      <w:r>
-        <w:rPr>
-          <w:rFonts w:ascii="Calibri" w:hAnsi="Calibri"/>
-          <w:sz w:val="24"/>
-        </w:rPr>
-        <w:t>Anurag Chaurasia</w:t>
+        <w:t>Submitted By: Anurag Chaurasia (2022ccsb098),  Rajesh Kumar (2022csb094),  Adrija Paul (2022csb082)</w:t>
       </w:r>
     </w:p>
     <w:p>
@@ -156,7 +140,7 @@
           <w:rFonts w:ascii="Calibri" w:hAnsi="Calibri"/>
           <w:sz w:val="24"/>
         </w:rPr>
-        <w:t>This is to certify that the project entitled "PROT2CHAT: PROTEIN LARGE LANGUAGE MODEL WITH EARLY FUSION OF TEXT, SEQUENCE, AND STRUCTURE" is submitted by Anurag Chaurasia as a part of the curriculum for the award of the degree of Bachelor of Technology in Computer Science and Technology from the Indian Institute of Engineering Science and Technology, Shibpur, during the academic session 2025-2026.</w:t>
+        <w:t>This is to certify that the project entitled "PROT2CHAT: PROTEIN LARGE LANGUAGE MODEL WITH EARLY FUSION OF TEXT, SEQUENCE, AND STRUCTURE" is submitted by Anurag Chaurasia (2022ccsb098), Rajesh Kumar (2022csb094), and Adrija Paul (2022csb082) as a part of the curriculum for the award of the degree of Bachelor of Technology in Computer Science and Technology from the Indian Institute of Engineering Science and Technology, Shibpur, during the academic session 2025-2026.</w:t>
       </w:r>
     </w:p>
     <w:p/>
@@ -190,7 +174,7 @@
           <w:rFonts w:ascii="Calibri" w:hAnsi="Calibri"/>
           <w:sz w:val="24"/>
         </w:rPr>
-        <w:t>Dr. Apurba Sarkar                                                    External Examiner</w:t>
+        <w:t>Surajeet Ghosh                                                    External Examiner</w:t>
       </w:r>
     </w:p>
     <w:p>
@@ -199,7 +183,7 @@
           <w:rFonts w:ascii="Calibri" w:hAnsi="Calibri"/>
           <w:sz w:val="24"/>
         </w:rPr>
-        <w:t>Head of Department</w:t>
+        <w:t>Associate Professor</w:t>
       </w:r>
     </w:p>
     <w:p>

</xml_diff>